<commit_message>
story map calée avec product backlog après perturbation j4
</commit_message>
<xml_diff>
--- a/docs/pilotage/product-backlog +perturbations j4.docx
+++ b/docs/pilotage/product-backlog +perturbations j4.docx
@@ -4859,7 +4859,6 @@
           <w:sz w:val="20"/>
         </w:rPr>
       </w:pPr>
-      <w:proofErr w:type="spellStart"/>
       <w:r>
         <w:rPr>
           <w:b/>
@@ -4870,20 +4869,19 @@
       </w:r>
       <w:r>
         <w:rPr>
-          <w:i/>
-          <w:color w:val="475569"/>
-          <w:sz w:val="20"/>
-        </w:rPr>
-        <w:t>Liste</w:t>
-      </w:r>
-      <w:proofErr w:type="spellEnd"/>
-      <w:r>
-        <w:rPr>
-          <w:i/>
-          <w:color w:val="475569"/>
-          <w:sz w:val="20"/>
-        </w:rPr>
-        <w:t xml:space="preserve"> ordonnée et priorisée de TOUTES les fonctionnalités du produit. Source unique de vérité du </w:t>
+          <w:b/>
+          <w:color w:val="F59E0B"/>
+          <w:sz w:val="20"/>
+        </w:rPr>
+        <w:t xml:space="preserve"> </w:t>
+      </w:r>
+      <w:r>
+        <w:rPr>
+          <w:i/>
+          <w:color w:val="475569"/>
+          <w:sz w:val="20"/>
+        </w:rPr>
+        <w:t xml:space="preserve">Liste ordonnée et priorisée de TOUTES les fonctionnalités du produit. Source unique de vérité du </w:t>
       </w:r>
       <w:proofErr w:type="spellStart"/>
       <w:r>
@@ -4912,7 +4910,6 @@
         </w:rPr>
         <w:t xml:space="preserve">k </w:t>
       </w:r>
-      <w:proofErr w:type="spellStart"/>
       <w:r>
         <w:rPr>
           <w:b/>
@@ -4923,11 +4920,37 @@
       </w:r>
       <w:r>
         <w:rPr>
-          <w:i/>
-          <w:color w:val="475569"/>
-          <w:sz w:val="20"/>
-        </w:rPr>
-        <w:t>Independent</w:t>
+          <w:b/>
+          <w:color w:val="F59E0B"/>
+          <w:sz w:val="20"/>
+        </w:rPr>
+        <w:t xml:space="preserve">T </w:t>
+      </w:r>
+      <w:r>
+        <w:rPr>
+          <w:i/>
+          <w:color w:val="475569"/>
+          <w:sz w:val="20"/>
+        </w:rPr>
+        <w:t>Independent ·</w:t>
+      </w:r>
+      <w:r>
+        <w:rPr>
+          <w:i/>
+          <w:color w:val="475569"/>
+          <w:spacing w:val="13"/>
+          <w:sz w:val="20"/>
+        </w:rPr>
+        <w:t xml:space="preserve"> </w:t>
+      </w:r>
+      <w:proofErr w:type="spellStart"/>
+      <w:r>
+        <w:rPr>
+          <w:i/>
+          <w:color w:val="475569"/>
+          <w:sz w:val="20"/>
+        </w:rPr>
+        <w:t>Negotiable</w:t>
       </w:r>
       <w:proofErr w:type="spellEnd"/>
       <w:r>
@@ -4954,7 +4977,7 @@
           <w:color w:val="475569"/>
           <w:sz w:val="20"/>
         </w:rPr>
-        <w:t>Negotiable</w:t>
+        <w:t>Valuable</w:t>
       </w:r>
       <w:proofErr w:type="spellEnd"/>
       <w:r>
@@ -4974,23 +4997,13 @@
         </w:rPr>
         <w:t xml:space="preserve"> </w:t>
       </w:r>
-      <w:proofErr w:type="spellStart"/>
-      <w:r>
-        <w:rPr>
-          <w:i/>
-          <w:color w:val="475569"/>
-          <w:sz w:val="20"/>
-        </w:rPr>
-        <w:t>Valuable</w:t>
-      </w:r>
-      <w:proofErr w:type="spellEnd"/>
-      <w:r>
-        <w:rPr>
-          <w:i/>
-          <w:color w:val="475569"/>
-          <w:sz w:val="20"/>
-        </w:rPr>
-        <w:t xml:space="preserve"> ·</w:t>
+      <w:r>
+        <w:rPr>
+          <w:i/>
+          <w:color w:val="475569"/>
+          <w:sz w:val="20"/>
+        </w:rPr>
+        <w:t>Estimable ·</w:t>
       </w:r>
       <w:r>
         <w:rPr>
@@ -5007,7 +5020,7 @@
           <w:color w:val="475569"/>
           <w:sz w:val="20"/>
         </w:rPr>
-        <w:t>Estimable ·</w:t>
+        <w:t>Small</w:t>
       </w:r>
       <w:r>
         <w:rPr>
@@ -5024,7 +5037,7 @@
           <w:color w:val="475569"/>
           <w:sz w:val="20"/>
         </w:rPr>
-        <w:t>Small</w:t>
+        <w:t>·</w:t>
       </w:r>
       <w:r>
         <w:rPr>
@@ -5041,7 +5054,7 @@
           <w:color w:val="475569"/>
           <w:sz w:val="20"/>
         </w:rPr>
-        <w:t>·</w:t>
+        <w:t>Testable.</w:t>
       </w:r>
       <w:r>
         <w:rPr>
@@ -5058,7 +5071,7 @@
           <w:color w:val="475569"/>
           <w:sz w:val="20"/>
         </w:rPr>
-        <w:t>Testable.</w:t>
+        <w:t>Format de phrase : «</w:t>
       </w:r>
       <w:r>
         <w:rPr>
@@ -5075,7 +5088,7 @@
           <w:color w:val="475569"/>
           <w:sz w:val="20"/>
         </w:rPr>
-        <w:t>Format de phrase : «</w:t>
+        <w:t>En</w:t>
       </w:r>
       <w:r>
         <w:rPr>
@@ -5086,39 +5099,21 @@
         </w:rPr>
         <w:t xml:space="preserve"> </w:t>
       </w:r>
-      <w:r>
-        <w:rPr>
-          <w:i/>
-          <w:color w:val="475569"/>
-          <w:sz w:val="20"/>
-        </w:rPr>
-        <w:t>En</w:t>
-      </w:r>
-      <w:r>
-        <w:rPr>
-          <w:i/>
-          <w:color w:val="475569"/>
-          <w:spacing w:val="13"/>
-          <w:sz w:val="20"/>
-        </w:rPr>
-        <w:t xml:space="preserve"> </w:t>
-      </w:r>
-      <w:r>
-        <w:rPr>
-          <w:i/>
-          <w:color w:val="475569"/>
-          <w:sz w:val="20"/>
-        </w:rPr>
-        <w:t xml:space="preserve">tant que </w:t>
-      </w:r>
-      <w:r>
-        <w:rPr>
-          <w:rFonts w:ascii="Segoe UI Symbol" w:hAnsi="Segoe UI Symbol"/>
-          <w:color w:val="16A34A"/>
-          <w:sz w:val="20"/>
-        </w:rPr>
-        <w:t xml:space="preserve">Q </w:t>
-      </w:r>
+    </w:p>
+    <w:p>
+      <w:pPr>
+        <w:pStyle w:val="ListParagraph"/>
+        <w:tabs>
+          <w:tab w:val="left" w:pos="662"/>
+        </w:tabs>
+        <w:spacing w:before="0" w:line="256" w:lineRule="auto"/>
+        <w:ind w:left="408" w:right="622" w:firstLine="0"/>
+        <w:jc w:val="both"/>
+        <w:rPr>
+          <w:i/>
+          <w:sz w:val="20"/>
+        </w:rPr>
+      </w:pPr>
       <w:proofErr w:type="gramStart"/>
       <w:r>
         <w:rPr>
@@ -5336,6 +5331,14 @@
           <w:sz w:val="20"/>
         </w:rPr>
         <w:t>ÉVIT</w:t>
+      </w:r>
+      <w:r>
+        <w:rPr>
+          <w:b/>
+          <w:color w:val="DC2626"/>
+          <w:sz w:val="20"/>
+        </w:rPr>
+        <w:t>ER</w:t>
       </w:r>
       <w:r>
         <w:rPr>
@@ -19989,15 +19992,7 @@
                 <w:color w:val="475569"/>
                 <w:sz w:val="20"/>
               </w:rPr>
-              <w:t>35</w:t>
-            </w:r>
-            <w:r>
-              <w:rPr>
-                <w:i/>
-                <w:color w:val="475569"/>
-                <w:sz w:val="20"/>
-              </w:rPr>
-              <w:t>stories</w:t>
+              <w:t>35stories</w:t>
             </w:r>
             <w:r>
               <w:rPr>
@@ -26992,6 +26987,7 @@
   <w:style w:type="character" w:default="1" w:styleId="DefaultParagraphFont">
     <w:name w:val="Default Paragraph Font"/>
     <w:uiPriority w:val="1"/>
+    <w:semiHidden/>
     <w:unhideWhenUsed/>
   </w:style>
   <w:style w:type="table" w:default="1" w:styleId="TableNormal">

</xml_diff>